<commit_message>
Doku: Bedienungsanleitung (DOCX) aktualisiert
Co-Authored-By: Claude Sonnet 5 <noreply@anthropic.com>
</commit_message>
<xml_diff>
--- a/Dokumentation/Bedienungsanleitung/DOC/bTn_Wecker_Bedienungsanleitung.docx
+++ b/Dokumentation/Bedienungsanleitung/DOC/bTn_Wecker_Bedienungsanleitung.docx
@@ -9,17 +9,9 @@
       <w:r>
         <w:rPr>
           <w:b/>
-          <w:i w:val="0"/>
           <w:sz w:val="52"/>
         </w:rPr>
-        <w:t>bTn</w:t>
-      </w:r>
-      <w:r>
-        <w:rPr>
-          <w:b/>
-          <w:sz w:val="52"/>
-        </w:rPr>
-        <w:t xml:space="preserve"> Wecker</w:t>
+        <w:t>bTn Wecker</w:t>
       </w:r>
     </w:p>
     <w:p>
@@ -28,8 +20,6 @@
       </w:pPr>
       <w:r>
         <w:rPr>
-          <w:b w:val="0"/>
-          <w:i w:val="0"/>
           <w:sz w:val="26"/>
         </w:rPr>
         <w:t>Bedienungsanleitung</w:t>
@@ -41,7 +31,6 @@
       </w:pPr>
       <w:r>
         <w:rPr>
-          <w:b w:val="0"/>
           <w:i/>
           <w:sz w:val="18"/>
         </w:rPr>
@@ -62,10 +51,11 @@
         <w:t>Der bTn Wecker ist ein ESP32-basierter Wecker mit OLED-Anzeige, MP3-Wiedergabe (DFPlayer Mini), kapazitiven Touch-Feldern, drei Drucktastern und WiFi/NTP-Zeitsynchronisation. Alle Einstellungen werden dauerhaft im internen Flash gespeichert.</w:t>
       </w:r>
     </w:p>
+    <w:p/>
     <w:tbl>
       <w:tblPr>
-        <w:tblW w:type="auto" w:w="0"/>
-        <w:tblLook w:firstColumn="1" w:firstRow="1" w:lastColumn="0" w:lastRow="0" w:noHBand="0" w:noVBand="1" w:val="04A0"/>
+        <w:tblW w:w="0" w:type="auto"/>
+        <w:tblLook w:val="04A0" w:firstRow="1" w:lastRow="0" w:firstColumn="1" w:lastColumn="0" w:noHBand="0" w:noVBand="1"/>
       </w:tblPr>
       <w:tblGrid>
         <w:gridCol w:w="4819"/>
@@ -74,7 +64,7 @@
       <w:tr>
         <w:tc>
           <w:tcPr>
-            <w:tcW w:type="dxa" w:w="4819"/>
+            <w:tcW w:w="4819" w:type="dxa"/>
           </w:tcPr>
           <w:p>
             <w:r>
@@ -87,7 +77,7 @@
         </w:tc>
         <w:tc>
           <w:tcPr>
-            <w:tcW w:type="dxa" w:w="4819"/>
+            <w:tcW w:w="4819" w:type="dxa"/>
           </w:tcPr>
           <w:p>
             <w:r>
@@ -102,7 +92,7 @@
       <w:tr>
         <w:tc>
           <w:tcPr>
-            <w:tcW w:type="dxa" w:w="4819"/>
+            <w:tcW w:w="4819" w:type="dxa"/>
           </w:tcPr>
           <w:p>
             <w:r>
@@ -115,13 +105,10 @@
         </w:tc>
         <w:tc>
           <w:tcPr>
-            <w:tcW w:type="dxa" w:w="4819"/>
-          </w:tcPr>
-          <w:p>
-            <w:r>
-              <w:rPr>
-                <w:b w:val="0"/>
-              </w:rPr>
+            <w:tcW w:w="4819" w:type="dxa"/>
+          </w:tcPr>
+          <w:p>
+            <w:r>
               <w:t>SSD1306 OLED 128×64 Pixel, I²C</w:t>
             </w:r>
           </w:p>
@@ -130,7 +117,7 @@
       <w:tr>
         <w:tc>
           <w:tcPr>
-            <w:tcW w:type="dxa" w:w="4819"/>
+            <w:tcW w:w="4819" w:type="dxa"/>
           </w:tcPr>
           <w:p>
             <w:r>
@@ -143,13 +130,10 @@
         </w:tc>
         <w:tc>
           <w:tcPr>
-            <w:tcW w:type="dxa" w:w="4819"/>
-          </w:tcPr>
-          <w:p>
-            <w:r>
-              <w:rPr>
-                <w:b w:val="0"/>
-              </w:rPr>
+            <w:tcW w:w="4819" w:type="dxa"/>
+          </w:tcPr>
+          <w:p>
+            <w:r>
               <w:t>DFPlayer Mini, SD-Karte, Ordner 01 = Alarm-Sounds. Ab Hardware 2v0 zusätzlich mit BUSY-Signal (GPIO34) überwacht</w:t>
             </w:r>
           </w:p>
@@ -158,7 +142,7 @@
       <w:tr>
         <w:tc>
           <w:tcPr>
-            <w:tcW w:type="dxa" w:w="4819"/>
+            <w:tcW w:w="4819" w:type="dxa"/>
           </w:tcPr>
           <w:p>
             <w:r>
@@ -171,13 +155,10 @@
         </w:tc>
         <w:tc>
           <w:tcPr>
-            <w:tcW w:type="dxa" w:w="4819"/>
-          </w:tcPr>
-          <w:p>
-            <w:r>
-              <w:rPr>
-                <w:b w:val="0"/>
-              </w:rPr>
+            <w:tcW w:w="4819" w:type="dxa"/>
+          </w:tcPr>
+          <w:p>
+            <w:r>
               <w:t>T0, T2, T3, T4 – kapazitiv, Hold + Repeat</w:t>
             </w:r>
           </w:p>
@@ -186,7 +167,7 @@
       <w:tr>
         <w:tc>
           <w:tcPr>
-            <w:tcW w:type="dxa" w:w="4819"/>
+            <w:tcW w:w="4819" w:type="dxa"/>
           </w:tcPr>
           <w:p>
             <w:r>
@@ -199,13 +180,10 @@
         </w:tc>
         <w:tc>
           <w:tcPr>
-            <w:tcW w:type="dxa" w:w="4819"/>
-          </w:tcPr>
-          <w:p>
-            <w:r>
-              <w:rPr>
-                <w:b w:val="0"/>
-              </w:rPr>
+            <w:tcW w:w="4819" w:type="dxa"/>
+          </w:tcPr>
+          <w:p>
+            <w:r>
               <w:t>S1, S2, S3</w:t>
             </w:r>
           </w:p>
@@ -214,7 +192,7 @@
       <w:tr>
         <w:tc>
           <w:tcPr>
-            <w:tcW w:type="dxa" w:w="4819"/>
+            <w:tcW w:w="4819" w:type="dxa"/>
           </w:tcPr>
           <w:p>
             <w:r>
@@ -227,13 +205,10 @@
         </w:tc>
         <w:tc>
           <w:tcPr>
-            <w:tcW w:type="dxa" w:w="4819"/>
-          </w:tcPr>
-          <w:p>
-            <w:r>
-              <w:rPr>
-                <w:b w:val="0"/>
-              </w:rPr>
+            <w:tcW w:w="4819" w:type="dxa"/>
+          </w:tcPr>
+          <w:p>
+            <w:r>
               <w:t>E1 = Kuckuck, E2 = Mühlrad/Motor, E3 = Licht</w:t>
             </w:r>
           </w:p>
@@ -242,7 +217,7 @@
       <w:tr>
         <w:tc>
           <w:tcPr>
-            <w:tcW w:type="dxa" w:w="4819"/>
+            <w:tcW w:w="4819" w:type="dxa"/>
           </w:tcPr>
           <w:p>
             <w:r>
@@ -255,13 +230,10 @@
         </w:tc>
         <w:tc>
           <w:tcPr>
-            <w:tcW w:type="dxa" w:w="4819"/>
-          </w:tcPr>
-          <w:p>
-            <w:r>
-              <w:rPr>
-                <w:b w:val="0"/>
-              </w:rPr>
+            <w:tcW w:w="4819" w:type="dxa"/>
+          </w:tcPr>
+          <w:p>
+            <w:r>
               <w:t>WLAN-Verbindung für automatische Zeitsynchronisation</w:t>
             </w:r>
           </w:p>
@@ -270,7 +242,7 @@
       <w:tr>
         <w:tc>
           <w:tcPr>
-            <w:tcW w:type="dxa" w:w="4819"/>
+            <w:tcW w:w="4819" w:type="dxa"/>
           </w:tcPr>
           <w:p>
             <w:r>
@@ -283,13 +255,10 @@
         </w:tc>
         <w:tc>
           <w:tcPr>
-            <w:tcW w:type="dxa" w:w="4819"/>
-          </w:tcPr>
-          <w:p>
-            <w:r>
-              <w:rPr>
-                <w:b w:val="0"/>
-              </w:rPr>
+            <w:tcW w:w="4819" w:type="dxa"/>
+          </w:tcPr>
+          <w:p>
+            <w:r>
               <w:t>Diagnose-Seite im Browser: http://IP:8080, inkl. Mühlrad-Motor-Regler</w:t>
             </w:r>
           </w:p>
@@ -307,8 +276,8 @@
     </w:p>
     <w:tbl>
       <w:tblPr>
-        <w:tblW w:type="auto" w:w="0"/>
-        <w:tblLook w:firstColumn="1" w:firstRow="1" w:lastColumn="0" w:lastRow="0" w:noHBand="0" w:noVBand="1" w:val="04A0"/>
+        <w:tblW w:w="0" w:type="auto"/>
+        <w:tblLook w:val="04A0" w:firstRow="1" w:lastRow="0" w:firstColumn="1" w:lastColumn="0" w:noHBand="0" w:noVBand="1"/>
       </w:tblPr>
       <w:tblGrid>
         <w:gridCol w:w="4819"/>
@@ -317,7 +286,7 @@
       <w:tr>
         <w:tc>
           <w:tcPr>
-            <w:tcW w:type="dxa" w:w="4819"/>
+            <w:tcW w:w="4819" w:type="dxa"/>
           </w:tcPr>
           <w:p>
             <w:r>
@@ -330,7 +299,7 @@
         </w:tc>
         <w:tc>
           <w:tcPr>
-            <w:tcW w:type="dxa" w:w="4819"/>
+            <w:tcW w:w="4819" w:type="dxa"/>
           </w:tcPr>
           <w:p>
             <w:r>
@@ -345,7 +314,7 @@
       <w:tr>
         <w:tc>
           <w:tcPr>
-            <w:tcW w:type="dxa" w:w="4819"/>
+            <w:tcW w:w="4819" w:type="dxa"/>
           </w:tcPr>
           <w:p>
             <w:r>
@@ -358,13 +327,10 @@
         </w:tc>
         <w:tc>
           <w:tcPr>
-            <w:tcW w:type="dxa" w:w="4819"/>
-          </w:tcPr>
-          <w:p>
-            <w:r>
-              <w:rPr>
-                <w:b w:val="0"/>
-              </w:rPr>
+            <w:tcW w:w="4819" w:type="dxa"/>
+          </w:tcPr>
+          <w:p>
+            <w:r>
               <w:t>Menüseite vorwärts: 0 → 1 → 2 → 3 → 4 → 5 → 6 → 0  (zyklisch)</w:t>
             </w:r>
           </w:p>
@@ -373,7 +339,7 @@
       <w:tr>
         <w:tc>
           <w:tcPr>
-            <w:tcW w:type="dxa" w:w="4819"/>
+            <w:tcW w:w="4819" w:type="dxa"/>
           </w:tcPr>
           <w:p>
             <w:r>
@@ -386,13 +352,10 @@
         </w:tc>
         <w:tc>
           <w:tcPr>
-            <w:tcW w:type="dxa" w:w="4819"/>
-          </w:tcPr>
-          <w:p>
-            <w:r>
-              <w:rPr>
-                <w:b w:val="0"/>
-              </w:rPr>
+            <w:tcW w:w="4819" w:type="dxa"/>
+          </w:tcPr>
+          <w:p>
+            <w:r>
               <w:t>Checkbox Ein/Aus auf der aktuellen Seite; auf Seite 3/4: Vorschau-Sound</w:t>
             </w:r>
           </w:p>
@@ -401,7 +364,7 @@
       <w:tr>
         <w:tc>
           <w:tcPr>
-            <w:tcW w:type="dxa" w:w="4819"/>
+            <w:tcW w:w="4819" w:type="dxa"/>
           </w:tcPr>
           <w:p>
             <w:r>
@@ -414,13 +377,10 @@
         </w:tc>
         <w:tc>
           <w:tcPr>
-            <w:tcW w:type="dxa" w:w="4819"/>
-          </w:tcPr>
-          <w:p>
-            <w:r>
-              <w:rPr>
-                <w:b w:val="0"/>
-              </w:rPr>
+            <w:tcW w:w="4819" w:type="dxa"/>
+          </w:tcPr>
+          <w:p>
+            <w:r>
               <w:t>Wert erhöhen: Stunde +, Von-Zeit +, Lautstärke +; Hold: Dauerwiederholung</w:t>
             </w:r>
           </w:p>
@@ -429,7 +389,7 @@
       <w:tr>
         <w:tc>
           <w:tcPr>
-            <w:tcW w:type="dxa" w:w="4819"/>
+            <w:tcW w:w="4819" w:type="dxa"/>
           </w:tcPr>
           <w:p>
             <w:r>
@@ -442,13 +402,10 @@
         </w:tc>
         <w:tc>
           <w:tcPr>
-            <w:tcW w:type="dxa" w:w="4819"/>
-          </w:tcPr>
-          <w:p>
-            <w:r>
-              <w:rPr>
-                <w:b w:val="0"/>
-              </w:rPr>
+            <w:tcW w:w="4819" w:type="dxa"/>
+          </w:tcPr>
+          <w:p>
+            <w:r>
               <w:t>Wert erhöhen: Minute +, Bis-Zeit +; Hold: Dauerwiederholung  ·  Seite 0: Lautstärke –</w:t>
             </w:r>
           </w:p>
@@ -457,7 +414,7 @@
       <w:tr>
         <w:tc>
           <w:tcPr>
-            <w:tcW w:type="dxa" w:w="4819"/>
+            <w:tcW w:w="4819" w:type="dxa"/>
           </w:tcPr>
           <w:p>
             <w:r>
@@ -470,13 +427,10 @@
         </w:tc>
         <w:tc>
           <w:tcPr>
-            <w:tcW w:type="dxa" w:w="4819"/>
-          </w:tcPr>
-          <w:p>
-            <w:r>
-              <w:rPr>
-                <w:b w:val="0"/>
-              </w:rPr>
+            <w:tcW w:w="4819" w:type="dxa"/>
+          </w:tcPr>
+          <w:p>
+            <w:r>
               <w:t>Laufenden Alarm oder Sound stoppen; wenn kein Alarm: Kuckuck einmalig auslösen</w:t>
             </w:r>
           </w:p>
@@ -485,7 +439,7 @@
       <w:tr>
         <w:tc>
           <w:tcPr>
-            <w:tcW w:type="dxa" w:w="4819"/>
+            <w:tcW w:w="4819" w:type="dxa"/>
           </w:tcPr>
           <w:p>
             <w:r>
@@ -498,13 +452,10 @@
         </w:tc>
         <w:tc>
           <w:tcPr>
-            <w:tcW w:type="dxa" w:w="4819"/>
-          </w:tcPr>
-          <w:p>
-            <w:r>
-              <w:rPr>
-                <w:b w:val="0"/>
-              </w:rPr>
+            <w:tcW w:w="4819" w:type="dxa"/>
+          </w:tcPr>
+          <w:p>
+            <w:r>
               <w:t>Zugschalter: Licht (E3) und Mühlrad (E2) gleichzeitig Ein/Aus toggeln. Schaltet nach 30 Minuten ohne erneuten Tastendruck automatisch wieder ab</w:t>
             </w:r>
           </w:p>
@@ -513,7 +464,7 @@
       <w:tr>
         <w:tc>
           <w:tcPr>
-            <w:tcW w:type="dxa" w:w="4819"/>
+            <w:tcW w:w="4819" w:type="dxa"/>
           </w:tcPr>
           <w:p>
             <w:r>
@@ -526,13 +477,10 @@
         </w:tc>
         <w:tc>
           <w:tcPr>
-            <w:tcW w:type="dxa" w:w="4819"/>
-          </w:tcPr>
-          <w:p>
-            <w:r>
-              <w:rPr>
-                <w:b w:val="0"/>
-              </w:rPr>
+            <w:tcW w:w="4819" w:type="dxa"/>
+          </w:tcPr>
+          <w:p>
+            <w:r>
               <w:t>Info-Seite ein-/ausblenden (von jeder Seite aus erreichbar); bei ausgeschaltetem Display weckt S3 das Display und öffnet die Info-Seite (11v04)</w:t>
             </w:r>
           </w:p>
@@ -551,12 +499,17 @@
         <w:t xml:space="preserve">  Touch-Felder T3 und T4 unterstützen Dauerberührung. Nach 750 ms wechselt das Feld in den Repeat-Modus und sendet alle 250 ms einen weiteren Impuls – nützlich für schnelles Einstellen von Stunden und Minuten. Klemmt ein Touch-Feld dauerhaft (z.B. durch Feuchtigkeit), erzwingt die Firmware nach einigen Sekunden einen Reset des betroffenen Felds, damit z.B. die Lautstärke nicht unbemerkt bis auf 0 heruntergezählt wird.</w:t>
       </w:r>
     </w:p>
-    <w:p/>
+    <w:p>
+      <w:r>
+        <w:br w:type="page"/>
+      </w:r>
+    </w:p>
     <w:p>
       <w:pPr>
         <w:pStyle w:val="berschrift1"/>
       </w:pPr>
       <w:r>
+        <w:lastRenderedPageBreak/>
         <w:t>3.  Menüstruktur</w:t>
       </w:r>
     </w:p>
@@ -565,20 +518,21 @@
         <w:t>T0 wechselt die Seiten 0–6 zyklisch. S3 öffnet jederzeit die Info-Seite (Seite 7). Nach 20 Sekunden ohne Eingabe kehrt das Gerät automatisch zu Seite 0 zurück – auch von der Info-Seite. Nach 5 Minuten ohne Touch-Eingabe schaltet das OLED-Display ab; eine Berührung eines Touch-Felds (T0–T4) weckt das Display und verwirft das Event, während S3 das Display weckt und direkt die Info-Seite öffnet (11v04).</w:t>
       </w:r>
     </w:p>
+    <w:p/>
     <w:tbl>
       <w:tblPr>
-        <w:tblW w:type="auto" w:w="0"/>
-        <w:tblLook w:firstColumn="1" w:firstRow="1" w:lastColumn="0" w:lastRow="0" w:noHBand="0" w:noVBand="1" w:val="04A0"/>
+        <w:tblW w:w="0" w:type="auto"/>
+        <w:tblLook w:val="04A0" w:firstRow="1" w:lastRow="0" w:firstColumn="1" w:lastColumn="0" w:noHBand="0" w:noVBand="1"/>
       </w:tblPr>
       <w:tblGrid>
-        <w:gridCol w:w="3213"/>
+        <w:gridCol w:w="3212"/>
         <w:gridCol w:w="3213"/>
         <w:gridCol w:w="3213"/>
       </w:tblGrid>
       <w:tr>
         <w:tc>
           <w:tcPr>
-            <w:tcW w:type="dxa" w:w="3213"/>
+            <w:tcW w:w="3213" w:type="dxa"/>
           </w:tcPr>
           <w:p>
             <w:r>
@@ -591,7 +545,7 @@
         </w:tc>
         <w:tc>
           <w:tcPr>
-            <w:tcW w:type="dxa" w:w="3213"/>
+            <w:tcW w:w="3213" w:type="dxa"/>
           </w:tcPr>
           <w:p>
             <w:r>
@@ -604,7 +558,7 @@
         </w:tc>
         <w:tc>
           <w:tcPr>
-            <w:tcW w:type="dxa" w:w="3213"/>
+            <w:tcW w:w="3213" w:type="dxa"/>
           </w:tcPr>
           <w:p>
             <w:r>
@@ -619,7 +573,7 @@
       <w:tr>
         <w:tc>
           <w:tcPr>
-            <w:tcW w:type="dxa" w:w="3213"/>
+            <w:tcW w:w="3213" w:type="dxa"/>
           </w:tcPr>
           <w:p>
             <w:r>
@@ -632,7 +586,7 @@
         </w:tc>
         <w:tc>
           <w:tcPr>
-            <w:tcW w:type="dxa" w:w="3213"/>
+            <w:tcW w:w="3213" w:type="dxa"/>
           </w:tcPr>
           <w:p>
             <w:r>
@@ -645,13 +599,10 @@
         </w:tc>
         <w:tc>
           <w:tcPr>
-            <w:tcW w:type="dxa" w:w="3213"/>
-          </w:tcPr>
-          <w:p>
-            <w:r>
-              <w:rPr>
-                <w:b w:val="0"/>
-              </w:rPr>
+            <w:tcW w:w="3213" w:type="dxa"/>
+          </w:tcPr>
+          <w:p>
+            <w:r>
               <w:t>Zeitanzeige (groß), Datum, beide Alarmzeiten mit Checkbox, aktuelle Lautstärke. T3 = Vol+, T4 = Vol–.</w:t>
             </w:r>
           </w:p>
@@ -660,7 +611,7 @@
       <w:tr>
         <w:tc>
           <w:tcPr>
-            <w:tcW w:type="dxa" w:w="3213"/>
+            <w:tcW w:w="3213" w:type="dxa"/>
           </w:tcPr>
           <w:p>
             <w:r>
@@ -673,7 +624,7 @@
         </w:tc>
         <w:tc>
           <w:tcPr>
-            <w:tcW w:type="dxa" w:w="3213"/>
+            <w:tcW w:w="3213" w:type="dxa"/>
           </w:tcPr>
           <w:p>
             <w:r>
@@ -686,13 +637,10 @@
         </w:tc>
         <w:tc>
           <w:tcPr>
-            <w:tcW w:type="dxa" w:w="3213"/>
-          </w:tcPr>
-          <w:p>
-            <w:r>
-              <w:rPr>
-                <w:b w:val="0"/>
-              </w:rPr>
+            <w:tcW w:w="3213" w:type="dxa"/>
+          </w:tcPr>
+          <w:p>
+            <w:r>
               <w:t>T2 = Alarm 1 Ein/Aus  ·  T3 = Stunde +  ·  T4 = Minute +  (beide mit Überlauf)</w:t>
             </w:r>
           </w:p>
@@ -701,7 +649,7 @@
       <w:tr>
         <w:tc>
           <w:tcPr>
-            <w:tcW w:type="dxa" w:w="3213"/>
+            <w:tcW w:w="3213" w:type="dxa"/>
           </w:tcPr>
           <w:p>
             <w:r>
@@ -714,7 +662,7 @@
         </w:tc>
         <w:tc>
           <w:tcPr>
-            <w:tcW w:type="dxa" w:w="3213"/>
+            <w:tcW w:w="3213" w:type="dxa"/>
           </w:tcPr>
           <w:p>
             <w:r>
@@ -727,13 +675,10 @@
         </w:tc>
         <w:tc>
           <w:tcPr>
-            <w:tcW w:type="dxa" w:w="3213"/>
-          </w:tcPr>
-          <w:p>
-            <w:r>
-              <w:rPr>
-                <w:b w:val="0"/>
-              </w:rPr>
+            <w:tcW w:w="3213" w:type="dxa"/>
+          </w:tcPr>
+          <w:p>
+            <w:r>
               <w:t>T2 = Alarm 2 Ein/Aus  ·  T3 = Stunde +  ·  T4 = Minute +</w:t>
             </w:r>
           </w:p>
@@ -742,7 +687,7 @@
       <w:tr>
         <w:tc>
           <w:tcPr>
-            <w:tcW w:type="dxa" w:w="3213"/>
+            <w:tcW w:w="3213" w:type="dxa"/>
           </w:tcPr>
           <w:p>
             <w:r>
@@ -755,7 +700,7 @@
         </w:tc>
         <w:tc>
           <w:tcPr>
-            <w:tcW w:type="dxa" w:w="3213"/>
+            <w:tcW w:w="3213" w:type="dxa"/>
           </w:tcPr>
           <w:p>
             <w:r>
@@ -768,13 +713,10 @@
         </w:tc>
         <w:tc>
           <w:tcPr>
-            <w:tcW w:type="dxa" w:w="3213"/>
-          </w:tcPr>
-          <w:p>
-            <w:r>
-              <w:rPr>
-                <w:b w:val="0"/>
-              </w:rPr>
+            <w:tcW w:w="3213" w:type="dxa"/>
+          </w:tcPr>
+          <w:p>
+            <w:r>
               <w:t>T2 = Vorschau Ein/Aus (spielt Sound sofort); T3 = Datei +  ·  T4 = Datei –</w:t>
             </w:r>
           </w:p>
@@ -783,7 +725,7 @@
       <w:tr>
         <w:tc>
           <w:tcPr>
-            <w:tcW w:type="dxa" w:w="3213"/>
+            <w:tcW w:w="3213" w:type="dxa"/>
           </w:tcPr>
           <w:p>
             <w:r>
@@ -796,7 +738,7 @@
         </w:tc>
         <w:tc>
           <w:tcPr>
-            <w:tcW w:type="dxa" w:w="3213"/>
+            <w:tcW w:w="3213" w:type="dxa"/>
           </w:tcPr>
           <w:p>
             <w:r>
@@ -809,13 +751,10 @@
         </w:tc>
         <w:tc>
           <w:tcPr>
-            <w:tcW w:type="dxa" w:w="3213"/>
-          </w:tcPr>
-          <w:p>
-            <w:r>
-              <w:rPr>
-                <w:b w:val="0"/>
-              </w:rPr>
+            <w:tcW w:w="3213" w:type="dxa"/>
+          </w:tcPr>
+          <w:p>
+            <w:r>
               <w:t>T2 = Vorschau Ein/Aus  ·  T3 = Datei +  ·  T4 = Datei –</w:t>
             </w:r>
           </w:p>
@@ -824,7 +763,7 @@
       <w:tr>
         <w:tc>
           <w:tcPr>
-            <w:tcW w:type="dxa" w:w="3213"/>
+            <w:tcW w:w="3213" w:type="dxa"/>
           </w:tcPr>
           <w:p>
             <w:r>
@@ -837,7 +776,7 @@
         </w:tc>
         <w:tc>
           <w:tcPr>
-            <w:tcW w:type="dxa" w:w="3213"/>
+            <w:tcW w:w="3213" w:type="dxa"/>
           </w:tcPr>
           <w:p>
             <w:r>
@@ -850,13 +789,10 @@
         </w:tc>
         <w:tc>
           <w:tcPr>
-            <w:tcW w:type="dxa" w:w="3213"/>
-          </w:tcPr>
-          <w:p>
-            <w:r>
-              <w:rPr>
-                <w:b w:val="0"/>
-              </w:rPr>
+            <w:tcW w:w="3213" w:type="dxa"/>
+          </w:tcPr>
+          <w:p>
+            <w:r>
               <w:t>T2 = Kuckuck Ein/Aus; T3 = Licht Ein/Aus; T4 = Mühlrad Ein/Aus</w:t>
             </w:r>
           </w:p>
@@ -865,7 +801,7 @@
       <w:tr>
         <w:tc>
           <w:tcPr>
-            <w:tcW w:type="dxa" w:w="3213"/>
+            <w:tcW w:w="3213" w:type="dxa"/>
           </w:tcPr>
           <w:p>
             <w:r>
@@ -878,7 +814,7 @@
         </w:tc>
         <w:tc>
           <w:tcPr>
-            <w:tcW w:type="dxa" w:w="3213"/>
+            <w:tcW w:w="3213" w:type="dxa"/>
           </w:tcPr>
           <w:p>
             <w:r>
@@ -891,13 +827,10 @@
         </w:tc>
         <w:tc>
           <w:tcPr>
-            <w:tcW w:type="dxa" w:w="3213"/>
-          </w:tcPr>
-          <w:p>
-            <w:r>
-              <w:rPr>
-                <w:b w:val="0"/>
-              </w:rPr>
+            <w:tcW w:w="3213" w:type="dxa"/>
+          </w:tcPr>
+          <w:p>
+            <w:r>
               <w:t>T3 = Von-Stunde +  ·  T4 = Bis-Stunde +  (0–23, Mitternacht-Überlauf möglich)</w:t>
             </w:r>
           </w:p>
@@ -906,7 +839,7 @@
       <w:tr>
         <w:tc>
           <w:tcPr>
-            <w:tcW w:type="dxa" w:w="3213"/>
+            <w:tcW w:w="3213" w:type="dxa"/>
           </w:tcPr>
           <w:p>
             <w:r>
@@ -919,7 +852,7 @@
         </w:tc>
         <w:tc>
           <w:tcPr>
-            <w:tcW w:type="dxa" w:w="3213"/>
+            <w:tcW w:w="3213" w:type="dxa"/>
           </w:tcPr>
           <w:p>
             <w:r>
@@ -932,13 +865,10 @@
         </w:tc>
         <w:tc>
           <w:tcPr>
-            <w:tcW w:type="dxa" w:w="3213"/>
-          </w:tcPr>
-          <w:p>
-            <w:r>
-              <w:rPr>
-                <w:b w:val="0"/>
-              </w:rPr>
+            <w:tcW w:w="3213" w:type="dxa"/>
+          </w:tcPr>
+          <w:p>
+            <w:r>
               <w:t>Web-Log-Adresse (IP:8080), MP3-Dateianzahl, Reset-Zähler, Warnhinweise „Taste + WiFi Reset" (T3) und „Taste – Full Reset" (T4). Details siehe Abschnitt 7.</w:t>
             </w:r>
           </w:p>
@@ -946,11 +876,26 @@
       </w:tr>
     </w:tbl>
     <w:p/>
+    <w:p>
+      <w:pPr>
+        <w:rPr>
+          <w:b/>
+          <w:bCs/>
+          <w:color w:val="1F4E79"/>
+          <w:sz w:val="26"/>
+          <w:szCs w:val="26"/>
+        </w:rPr>
+      </w:pPr>
+      <w:r>
+        <w:br w:type="page"/>
+      </w:r>
+    </w:p>
     <w:p>
       <w:pPr>
         <w:pStyle w:val="berschrift1"/>
       </w:pPr>
       <w:r>
+        <w:lastRenderedPageBreak/>
         <w:t>4.  Alarmfunktion</w:t>
       </w:r>
     </w:p>
@@ -959,10 +904,11 @@
         <w:t>Der Wecker löst zur eingestellten Zeit aus, wenn der Alarm aktiviert ist (Checkbox auf Seite 1 oder 2). Die MP3-Datei wird aus Ordner 01 der SD-Karte abgespielt.</w:t>
       </w:r>
     </w:p>
+    <w:p/>
     <w:tbl>
       <w:tblPr>
-        <w:tblW w:type="auto" w:w="0"/>
-        <w:tblLook w:firstColumn="1" w:firstRow="1" w:lastColumn="0" w:lastRow="0" w:noHBand="0" w:noVBand="1" w:val="04A0"/>
+        <w:tblW w:w="0" w:type="auto"/>
+        <w:tblLook w:val="04A0" w:firstRow="1" w:lastRow="0" w:firstColumn="1" w:lastColumn="0" w:noHBand="0" w:noVBand="1"/>
       </w:tblPr>
       <w:tblGrid>
         <w:gridCol w:w="4819"/>
@@ -971,7 +917,7 @@
       <w:tr>
         <w:tc>
           <w:tcPr>
-            <w:tcW w:type="dxa" w:w="4819"/>
+            <w:tcW w:w="4819" w:type="dxa"/>
           </w:tcPr>
           <w:p>
             <w:r>
@@ -984,7 +930,7 @@
         </w:tc>
         <w:tc>
           <w:tcPr>
-            <w:tcW w:type="dxa" w:w="4819"/>
+            <w:tcW w:w="4819" w:type="dxa"/>
           </w:tcPr>
           <w:p>
             <w:r>
@@ -999,7 +945,7 @@
       <w:tr>
         <w:tc>
           <w:tcPr>
-            <w:tcW w:type="dxa" w:w="4819"/>
+            <w:tcW w:w="4819" w:type="dxa"/>
           </w:tcPr>
           <w:p>
             <w:r>
@@ -1012,13 +958,10 @@
         </w:tc>
         <w:tc>
           <w:tcPr>
-            <w:tcW w:type="dxa" w:w="4819"/>
-          </w:tcPr>
-          <w:p>
-            <w:r>
-              <w:rPr>
-                <w:b w:val="0"/>
-              </w:rPr>
+            <w:tcW w:w="4819" w:type="dxa"/>
+          </w:tcPr>
+          <w:p>
+            <w:r>
               <w:t>Alarm 1 hat Vorrang, wenn beide Alarme auf die gleiche Zeit eingestellt sind</w:t>
             </w:r>
           </w:p>
@@ -1027,7 +970,7 @@
       <w:tr>
         <w:tc>
           <w:tcPr>
-            <w:tcW w:type="dxa" w:w="4819"/>
+            <w:tcW w:w="4819" w:type="dxa"/>
           </w:tcPr>
           <w:p>
             <w:r>
@@ -1040,13 +983,10 @@
         </w:tc>
         <w:tc>
           <w:tcPr>
-            <w:tcW w:type="dxa" w:w="4819"/>
-          </w:tcPr>
-          <w:p>
-            <w:r>
-              <w:rPr>
-                <w:b w:val="0"/>
-              </w:rPr>
+            <w:tcW w:w="4819" w:type="dxa"/>
+          </w:tcPr>
+          <w:p>
+            <w:r>
               <w:t>S1 drücken – stoppt den Sound und alle Ausgänge (E2, E3)</w:t>
             </w:r>
           </w:p>
@@ -1055,7 +995,7 @@
       <w:tr>
         <w:tc>
           <w:tcPr>
-            <w:tcW w:type="dxa" w:w="4819"/>
+            <w:tcW w:w="4819" w:type="dxa"/>
           </w:tcPr>
           <w:p>
             <w:r>
@@ -1068,13 +1008,10 @@
         </w:tc>
         <w:tc>
           <w:tcPr>
-            <w:tcW w:type="dxa" w:w="4819"/>
-          </w:tcPr>
-          <w:p>
-            <w:r>
-              <w:rPr>
-                <w:b w:val="0"/>
-              </w:rPr>
+            <w:tcW w:w="4819" w:type="dxa"/>
+          </w:tcPr>
+          <w:p>
+            <w:r>
               <w:t>E3 (Licht) wird beim Alarm-Start eingeschaltet, wenn Checkbox auf Seite 5 aktiv</w:t>
             </w:r>
           </w:p>
@@ -1083,7 +1020,7 @@
       <w:tr>
         <w:tc>
           <w:tcPr>
-            <w:tcW w:type="dxa" w:w="4819"/>
+            <w:tcW w:w="4819" w:type="dxa"/>
           </w:tcPr>
           <w:p>
             <w:r>
@@ -1096,13 +1033,10 @@
         </w:tc>
         <w:tc>
           <w:tcPr>
-            <w:tcW w:type="dxa" w:w="4819"/>
-          </w:tcPr>
-          <w:p>
-            <w:r>
-              <w:rPr>
-                <w:b w:val="0"/>
-              </w:rPr>
+            <w:tcW w:w="4819" w:type="dxa"/>
+          </w:tcPr>
+          <w:p>
+            <w:r>
               <w:t>E2 (Mühlrad) wird beim Alarm-Start eingeschaltet, wenn Checkbox auf Seite 5 aktiv</w:t>
             </w:r>
           </w:p>
@@ -1111,7 +1045,7 @@
       <w:tr>
         <w:tc>
           <w:tcPr>
-            <w:tcW w:type="dxa" w:w="4819"/>
+            <w:tcW w:w="4819" w:type="dxa"/>
           </w:tcPr>
           <w:p>
             <w:r>
@@ -1124,13 +1058,10 @@
         </w:tc>
         <w:tc>
           <w:tcPr>
-            <w:tcW w:type="dxa" w:w="4819"/>
-          </w:tcPr>
-          <w:p>
-            <w:r>
-              <w:rPr>
-                <w:b w:val="0"/>
-              </w:rPr>
+            <w:tcW w:w="4819" w:type="dxa"/>
+          </w:tcPr>
+          <w:p>
+            <w:r>
               <w:t>Ist die eingestellte Lautstärke sehr niedrig, spielt der Alarm trotzdem mit einer festen Mindestlautstärke – die gespeicherte Einstellung selbst bleibt dabei unverändert</w:t>
             </w:r>
           </w:p>
@@ -1139,7 +1070,7 @@
       <w:tr>
         <w:tc>
           <w:tcPr>
-            <w:tcW w:type="dxa" w:w="4819"/>
+            <w:tcW w:w="4819" w:type="dxa"/>
           </w:tcPr>
           <w:p>
             <w:r>
@@ -1152,13 +1083,10 @@
         </w:tc>
         <w:tc>
           <w:tcPr>
-            <w:tcW w:type="dxa" w:w="4819"/>
-          </w:tcPr>
-          <w:p>
-            <w:r>
-              <w:rPr>
-                <w:b w:val="0"/>
-              </w:rPr>
+            <w:tcW w:w="4819" w:type="dxa"/>
+          </w:tcPr>
+          <w:p>
+            <w:r>
               <w:t>Derselbe Alarm kann am selben Kalendertag nicht erneut auslösen (Tages-Sperre). Wird die Alarmzeit auf der Einstellseite verändert, wird die Sperre für diesen Tag sofort wieder aufgehoben</w:t>
             </w:r>
           </w:p>
@@ -1167,7 +1095,7 @@
       <w:tr>
         <w:tc>
           <w:tcPr>
-            <w:tcW w:type="dxa" w:w="4819"/>
+            <w:tcW w:w="4819" w:type="dxa"/>
           </w:tcPr>
           <w:p>
             <w:r>
@@ -1180,13 +1108,10 @@
         </w:tc>
         <w:tc>
           <w:tcPr>
-            <w:tcW w:type="dxa" w:w="4819"/>
-          </w:tcPr>
-          <w:p>
-            <w:r>
-              <w:rPr>
-                <w:b w:val="0"/>
-              </w:rPr>
+            <w:tcW w:w="4819" w:type="dxa"/>
+          </w:tcPr>
+          <w:p>
+            <w:r>
               <w:t>Verpasst der Wecker den genauen Auslösezeitpunkt (z.B. durch einen kurzen Stromausfall), löst der Alarm innerhalb der folgenden Stunde nachträglich noch aus, statt ersatzlos zu entfallen</w:t>
             </w:r>
           </w:p>
@@ -1195,7 +1120,7 @@
       <w:tr>
         <w:tc>
           <w:tcPr>
-            <w:tcW w:type="dxa" w:w="4819"/>
+            <w:tcW w:w="4819" w:type="dxa"/>
           </w:tcPr>
           <w:p>
             <w:r>
@@ -1208,13 +1133,10 @@
         </w:tc>
         <w:tc>
           <w:tcPr>
-            <w:tcW w:type="dxa" w:w="4819"/>
-          </w:tcPr>
-          <w:p>
-            <w:r>
-              <w:rPr>
-                <w:b w:val="0"/>
-              </w:rPr>
+            <w:tcW w:w="4819" w:type="dxa"/>
+          </w:tcPr>
+          <w:p>
+            <w:r>
               <w:t>OLED wird beim Alarm-Start automatisch eingeschaltet, falls es zuvor nach 5 Minuten Ruhezeit abgeschaltet wurde</w:t>
             </w:r>
           </w:p>
@@ -1260,9 +1182,24 @@
     <w:p/>
     <w:p>
       <w:pPr>
+        <w:rPr>
+          <w:b/>
+          <w:bCs/>
+          <w:color w:val="1F4E79"/>
+          <w:sz w:val="26"/>
+          <w:szCs w:val="26"/>
+        </w:rPr>
+      </w:pPr>
+      <w:r>
+        <w:br w:type="page"/>
+      </w:r>
+    </w:p>
+    <w:p>
+      <w:pPr>
         <w:pStyle w:val="berschrift1"/>
       </w:pPr>
       <w:r>
+        <w:lastRenderedPageBreak/>
         <w:t>5.  Kuckucksfunktion</w:t>
       </w:r>
     </w:p>
@@ -1271,10 +1208,11 @@
         <w:t>Der Kuckuck (E1) löst automatisch zur vollen Stunde aus, wenn die Funktion aktiviert und die aktuelle Stunde im eingestellten Zeitfenster liegt.</w:t>
       </w:r>
     </w:p>
+    <w:p/>
     <w:tbl>
       <w:tblPr>
-        <w:tblW w:type="auto" w:w="0"/>
-        <w:tblLook w:firstColumn="1" w:firstRow="1" w:lastColumn="0" w:lastRow="0" w:noHBand="0" w:noVBand="1" w:val="04A0"/>
+        <w:tblW w:w="0" w:type="auto"/>
+        <w:tblLook w:val="04A0" w:firstRow="1" w:lastRow="0" w:firstColumn="1" w:lastColumn="0" w:noHBand="0" w:noVBand="1"/>
       </w:tblPr>
       <w:tblGrid>
         <w:gridCol w:w="4819"/>
@@ -1283,7 +1221,7 @@
       <w:tr>
         <w:tc>
           <w:tcPr>
-            <w:tcW w:type="dxa" w:w="4819"/>
+            <w:tcW w:w="4819" w:type="dxa"/>
           </w:tcPr>
           <w:p>
             <w:r>
@@ -1296,7 +1234,7 @@
         </w:tc>
         <w:tc>
           <w:tcPr>
-            <w:tcW w:type="dxa" w:w="4819"/>
+            <w:tcW w:w="4819" w:type="dxa"/>
           </w:tcPr>
           <w:p>
             <w:r>
@@ -1311,7 +1249,7 @@
       <w:tr>
         <w:tc>
           <w:tcPr>
-            <w:tcW w:type="dxa" w:w="4819"/>
+            <w:tcW w:w="4819" w:type="dxa"/>
           </w:tcPr>
           <w:p>
             <w:r>
@@ -1324,13 +1262,10 @@
         </w:tc>
         <w:tc>
           <w:tcPr>
-            <w:tcW w:type="dxa" w:w="4819"/>
-          </w:tcPr>
-          <w:p>
-            <w:r>
-              <w:rPr>
-                <w:b w:val="0"/>
-              </w:rPr>
+            <w:tcW w:w="4819" w:type="dxa"/>
+          </w:tcPr>
+          <w:p>
+            <w:r>
               <w:t>Checkbox auf Seite 5 (T2)</w:t>
             </w:r>
           </w:p>
@@ -1339,7 +1274,7 @@
       <w:tr>
         <w:tc>
           <w:tcPr>
-            <w:tcW w:type="dxa" w:w="4819"/>
+            <w:tcW w:w="4819" w:type="dxa"/>
           </w:tcPr>
           <w:p>
             <w:r>
@@ -1352,13 +1287,10 @@
         </w:tc>
         <w:tc>
           <w:tcPr>
-            <w:tcW w:type="dxa" w:w="4819"/>
-          </w:tcPr>
-          <w:p>
-            <w:r>
-              <w:rPr>
-                <w:b w:val="0"/>
-              </w:rPr>
+            <w:tcW w:w="4819" w:type="dxa"/>
+          </w:tcPr>
+          <w:p>
+            <w:r>
               <w:t>Seite 6: Von-Stunde (T3) und Bis-Stunde (T4). Mitternacht-Überlauf möglich (z.B. 22–06 Uhr)</w:t>
             </w:r>
           </w:p>
@@ -1367,7 +1299,7 @@
       <w:tr>
         <w:tc>
           <w:tcPr>
-            <w:tcW w:type="dxa" w:w="4819"/>
+            <w:tcW w:w="4819" w:type="dxa"/>
           </w:tcPr>
           <w:p>
             <w:r>
@@ -1380,13 +1312,10 @@
         </w:tc>
         <w:tc>
           <w:tcPr>
-            <w:tcW w:type="dxa" w:w="4819"/>
-          </w:tcPr>
-          <w:p>
-            <w:r>
-              <w:rPr>
-                <w:b w:val="0"/>
-              </w:rPr>
+            <w:tcW w:w="4819" w:type="dxa"/>
+          </w:tcPr>
+          <w:p>
+            <w:r>
               <w:t>S1 drücken, wenn kein Alarm läuft → Kuckuck einmalig auslösen (unabhängig von Zeitfenster und Checkbox)</w:t>
             </w:r>
           </w:p>
@@ -1395,7 +1324,7 @@
       <w:tr>
         <w:tc>
           <w:tcPr>
-            <w:tcW w:type="dxa" w:w="4819"/>
+            <w:tcW w:w="4819" w:type="dxa"/>
           </w:tcPr>
           <w:p>
             <w:r>
@@ -1408,13 +1337,10 @@
         </w:tc>
         <w:tc>
           <w:tcPr>
-            <w:tcW w:type="dxa" w:w="4819"/>
-          </w:tcPr>
-          <w:p>
-            <w:r>
-              <w:rPr>
-                <w:b w:val="0"/>
-              </w:rPr>
+            <w:tcW w:w="4819" w:type="dxa"/>
+          </w:tcPr>
+          <w:p>
+            <w:r>
               <w:t>7,5 Sekunden</w:t>
             </w:r>
           </w:p>
@@ -1423,7 +1349,7 @@
       <w:tr>
         <w:tc>
           <w:tcPr>
-            <w:tcW w:type="dxa" w:w="4819"/>
+            <w:tcW w:w="4819" w:type="dxa"/>
           </w:tcPr>
           <w:p>
             <w:r>
@@ -1436,13 +1362,10 @@
         </w:tc>
         <w:tc>
           <w:tcPr>
-            <w:tcW w:type="dxa" w:w="4819"/>
-          </w:tcPr>
-          <w:p>
-            <w:r>
-              <w:rPr>
-                <w:b w:val="0"/>
-              </w:rPr>
+            <w:tcW w:w="4819" w:type="dxa"/>
+          </w:tcPr>
+          <w:p>
+            <w:r>
               <w:t>Wenn Alarm 1 oder Alarm 2 auf dieselbe volle Stunde eingestellt ist</w:t>
             </w:r>
           </w:p>
@@ -1451,7 +1374,7 @@
       <w:tr>
         <w:tc>
           <w:tcPr>
-            <w:tcW w:type="dxa" w:w="4819"/>
+            <w:tcW w:w="4819" w:type="dxa"/>
           </w:tcPr>
           <w:p>
             <w:r>
@@ -1464,13 +1387,10 @@
         </w:tc>
         <w:tc>
           <w:tcPr>
-            <w:tcW w:type="dxa" w:w="4819"/>
-          </w:tcPr>
-          <w:p>
-            <w:r>
-              <w:rPr>
-                <w:b w:val="0"/>
-              </w:rPr>
+            <w:tcW w:w="4819" w:type="dxa"/>
+          </w:tcPr>
+          <w:p>
+            <w:r>
               <w:t>An beiden Zeitumstellungstagen ist die betroffene Stunde 02:00 Uhr durch eine Tag+Stunden-Sperre geschützt – der Kuckuck löst dort auch bei der doppelten Herbststunde nur einmal aus</w:t>
             </w:r>
           </w:p>
@@ -1491,10 +1411,11 @@
         <w:t>Auf den Seiten 3 und 4 kann der Alarm-Sound vor dem Speichern angehört werden.</w:t>
       </w:r>
     </w:p>
+    <w:p/>
     <w:tbl>
       <w:tblPr>
-        <w:tblW w:type="auto" w:w="0"/>
-        <w:tblLook w:firstColumn="1" w:firstRow="1" w:lastColumn="0" w:lastRow="0" w:noHBand="0" w:noVBand="1" w:val="04A0"/>
+        <w:tblW w:w="0" w:type="auto"/>
+        <w:tblLook w:val="04A0" w:firstRow="1" w:lastRow="0" w:firstColumn="1" w:lastColumn="0" w:noHBand="0" w:noVBand="1"/>
       </w:tblPr>
       <w:tblGrid>
         <w:gridCol w:w="4819"/>
@@ -1503,7 +1424,7 @@
       <w:tr>
         <w:tc>
           <w:tcPr>
-            <w:tcW w:type="dxa" w:w="4819"/>
+            <w:tcW w:w="4819" w:type="dxa"/>
           </w:tcPr>
           <w:p>
             <w:r>
@@ -1516,7 +1437,7 @@
         </w:tc>
         <w:tc>
           <w:tcPr>
-            <w:tcW w:type="dxa" w:w="4819"/>
+            <w:tcW w:w="4819" w:type="dxa"/>
           </w:tcPr>
           <w:p>
             <w:r>
@@ -1531,7 +1452,7 @@
       <w:tr>
         <w:tc>
           <w:tcPr>
-            <w:tcW w:type="dxa" w:w="4819"/>
+            <w:tcW w:w="4819" w:type="dxa"/>
           </w:tcPr>
           <w:p>
             <w:r>
@@ -1544,13 +1465,10 @@
         </w:tc>
         <w:tc>
           <w:tcPr>
-            <w:tcW w:type="dxa" w:w="4819"/>
-          </w:tcPr>
-          <w:p>
-            <w:r>
-              <w:rPr>
-                <w:b w:val="0"/>
-              </w:rPr>
+            <w:tcW w:w="4819" w:type="dxa"/>
+          </w:tcPr>
+          <w:p>
+            <w:r>
               <w:t>Vorschau toggeln: Sound wird sofort abgespielt oder gestoppt</w:t>
             </w:r>
           </w:p>
@@ -1559,7 +1477,7 @@
       <w:tr>
         <w:tc>
           <w:tcPr>
-            <w:tcW w:type="dxa" w:w="4819"/>
+            <w:tcW w:w="4819" w:type="dxa"/>
           </w:tcPr>
           <w:p>
             <w:r>
@@ -1572,13 +1490,10 @@
         </w:tc>
         <w:tc>
           <w:tcPr>
-            <w:tcW w:type="dxa" w:w="4819"/>
-          </w:tcPr>
-          <w:p>
-            <w:r>
-              <w:rPr>
-                <w:b w:val="0"/>
-              </w:rPr>
+            <w:tcW w:w="4819" w:type="dxa"/>
+          </w:tcPr>
+          <w:p>
+            <w:r>
               <w:t>Nächste Dateinummer – der neue Sound wird sofort als Vorschau abgespielt, wenn Vorschau aktiv</w:t>
             </w:r>
           </w:p>
@@ -1587,7 +1502,7 @@
       <w:tr>
         <w:tc>
           <w:tcPr>
-            <w:tcW w:type="dxa" w:w="4819"/>
+            <w:tcW w:w="4819" w:type="dxa"/>
           </w:tcPr>
           <w:p>
             <w:r>
@@ -1600,13 +1515,10 @@
         </w:tc>
         <w:tc>
           <w:tcPr>
-            <w:tcW w:type="dxa" w:w="4819"/>
-          </w:tcPr>
-          <w:p>
-            <w:r>
-              <w:rPr>
-                <w:b w:val="0"/>
-              </w:rPr>
+            <w:tcW w:w="4819" w:type="dxa"/>
+          </w:tcPr>
+          <w:p>
+            <w:r>
               <w:t>Vorherige Dateinummer – analog T3</w:t>
             </w:r>
           </w:p>
@@ -1615,7 +1527,7 @@
       <w:tr>
         <w:tc>
           <w:tcPr>
-            <w:tcW w:type="dxa" w:w="4819"/>
+            <w:tcW w:w="4819" w:type="dxa"/>
           </w:tcPr>
           <w:p>
             <w:r>
@@ -1628,13 +1540,10 @@
         </w:tc>
         <w:tc>
           <w:tcPr>
-            <w:tcW w:type="dxa" w:w="4819"/>
-          </w:tcPr>
-          <w:p>
-            <w:r>
-              <w:rPr>
-                <w:b w:val="0"/>
-              </w:rPr>
+            <w:tcW w:w="4819" w:type="dxa"/>
+          </w:tcPr>
+          <w:p>
+            <w:r>
               <w:t>Die gewählte Nummer wird als Alarm-Sound gespeichert, sobald Seite 3/4 verlassen wird</w:t>
             </w:r>
           </w:p>
@@ -1655,10 +1564,11 @@
         <w:t>Die Info-Seite zeigt Systemdaten und bietet Zugang zu Konfigurations- und Reset-Funktionen. Seit 11v02 werden die gefährlichen Aktionen explizit als Zeilen auf der Info-Seite benannt – die früher dort zusätzlich angezeigten WiFi-/NTP-Zeitstempel sind in den Web-Log umgezogen (siehe Abschnitt 8). Ab 11v05 wurden die WLAN-Reset-Taste von T0 auf T3 verlegt und die Zeilen auf die einheitliche „+ / –"-Bedienung umgestellt (Taste + = T3, Taste – = T4).</w:t>
       </w:r>
     </w:p>
+    <w:p/>
     <w:tbl>
       <w:tblPr>
-        <w:tblW w:type="auto" w:w="0"/>
-        <w:tblLook w:firstColumn="1" w:firstRow="1" w:lastColumn="0" w:lastRow="0" w:noHBand="0" w:noVBand="1" w:val="04A0"/>
+        <w:tblW w:w="0" w:type="auto"/>
+        <w:tblLook w:val="04A0" w:firstRow="1" w:lastRow="0" w:firstColumn="1" w:lastColumn="0" w:noHBand="0" w:noVBand="1"/>
       </w:tblPr>
       <w:tblGrid>
         <w:gridCol w:w="4819"/>
@@ -1667,7 +1577,7 @@
       <w:tr>
         <w:tc>
           <w:tcPr>
-            <w:tcW w:type="dxa" w:w="4819"/>
+            <w:tcW w:w="4819" w:type="dxa"/>
           </w:tcPr>
           <w:p>
             <w:r>
@@ -1680,7 +1590,7 @@
         </w:tc>
         <w:tc>
           <w:tcPr>
-            <w:tcW w:type="dxa" w:w="4819"/>
+            <w:tcW w:w="4819" w:type="dxa"/>
           </w:tcPr>
           <w:p>
             <w:r>
@@ -1695,7 +1605,7 @@
       <w:tr>
         <w:tc>
           <w:tcPr>
-            <w:tcW w:type="dxa" w:w="4819"/>
+            <w:tcW w:w="4819" w:type="dxa"/>
           </w:tcPr>
           <w:p>
             <w:r>
@@ -1708,13 +1618,10 @@
         </w:tc>
         <w:tc>
           <w:tcPr>
-            <w:tcW w:type="dxa" w:w="4819"/>
-          </w:tcPr>
-          <w:p>
-            <w:r>
-              <w:rPr>
-                <w:b w:val="0"/>
-              </w:rPr>
+            <w:tcW w:w="4819" w:type="dxa"/>
+          </w:tcPr>
+          <w:p>
+            <w:r>
               <w:t>Firmware-Kennung (z.B. bTn_Wecker_20v21)</w:t>
             </w:r>
           </w:p>
@@ -1723,7 +1630,7 @@
       <w:tr>
         <w:tc>
           <w:tcPr>
-            <w:tcW w:type="dxa" w:w="4819"/>
+            <w:tcW w:w="4819" w:type="dxa"/>
           </w:tcPr>
           <w:p>
             <w:r>
@@ -1736,13 +1643,10 @@
         </w:tc>
         <w:tc>
           <w:tcPr>
-            <w:tcW w:type="dxa" w:w="4819"/>
-          </w:tcPr>
-          <w:p>
-            <w:r>
-              <w:rPr>
-                <w:b w:val="0"/>
-              </w:rPr>
+            <w:tcW w:w="4819" w:type="dxa"/>
+          </w:tcPr>
+          <w:p>
+            <w:r>
               <w:t>Adresse des Web-Log-Servers – im Browser öffnen für Diagnoseinformationen</w:t>
             </w:r>
           </w:p>
@@ -1751,7 +1655,7 @@
       <w:tr>
         <w:tc>
           <w:tcPr>
-            <w:tcW w:type="dxa" w:w="4819"/>
+            <w:tcW w:w="4819" w:type="dxa"/>
           </w:tcPr>
           <w:p>
             <w:r>
@@ -1764,13 +1668,10 @@
         </w:tc>
         <w:tc>
           <w:tcPr>
-            <w:tcW w:type="dxa" w:w="4819"/>
-          </w:tcPr>
-          <w:p>
-            <w:r>
-              <w:rPr>
-                <w:b w:val="0"/>
-              </w:rPr>
+            <w:tcW w:w="4819" w:type="dxa"/>
+          </w:tcPr>
+          <w:p>
+            <w:r>
               <w:t>Anzahl gefundener MP3-Dateien  ·  Neustart-Zähler (4-stellig)</w:t>
             </w:r>
           </w:p>
@@ -1779,7 +1680,7 @@
       <w:tr>
         <w:tc>
           <w:tcPr>
-            <w:tcW w:type="dxa" w:w="4819"/>
+            <w:tcW w:w="4819" w:type="dxa"/>
           </w:tcPr>
           <w:p>
             <w:r>
@@ -1792,13 +1693,10 @@
         </w:tc>
         <w:tc>
           <w:tcPr>
-            <w:tcW w:type="dxa" w:w="4819"/>
-          </w:tcPr>
-          <w:p>
-            <w:r>
-              <w:rPr>
-                <w:b w:val="0"/>
-              </w:rPr>
+            <w:tcW w:w="4819" w:type="dxa"/>
+          </w:tcPr>
+          <w:p>
+            <w:r>
               <w:t>Hinweis: T3 drücken löscht die WLAN-Zugangsdaten und startet den Konfigurator</w:t>
             </w:r>
           </w:p>
@@ -1807,7 +1705,7 @@
       <w:tr>
         <w:tc>
           <w:tcPr>
-            <w:tcW w:type="dxa" w:w="4819"/>
+            <w:tcW w:w="4819" w:type="dxa"/>
           </w:tcPr>
           <w:p>
             <w:r>
@@ -1820,13 +1718,10 @@
         </w:tc>
         <w:tc>
           <w:tcPr>
-            <w:tcW w:type="dxa" w:w="4819"/>
-          </w:tcPr>
-          <w:p>
-            <w:r>
-              <w:rPr>
-                <w:b w:val="0"/>
-              </w:rPr>
+            <w:tcW w:w="4819" w:type="dxa"/>
+          </w:tcPr>
+          <w:p>
+            <w:r>
               <w:t>Hinweis: T4 drücken löscht alle Einstellungen (NVS-Erase) und startet neu</w:t>
             </w:r>
           </w:p>
@@ -1848,9 +1743,24 @@
     <w:p/>
     <w:p>
       <w:pPr>
+        <w:rPr>
+          <w:b/>
+          <w:bCs/>
+          <w:color w:val="1F4E79"/>
+          <w:sz w:val="26"/>
+          <w:szCs w:val="26"/>
+        </w:rPr>
+      </w:pPr>
+      <w:r>
+        <w:br w:type="page"/>
+      </w:r>
+    </w:p>
+    <w:p>
+      <w:pPr>
         <w:pStyle w:val="berschrift1"/>
       </w:pPr>
       <w:r>
+        <w:lastRenderedPageBreak/>
         <w:t>8.  Web-Log  (http://IP:8080)</w:t>
       </w:r>
     </w:p>
@@ -1859,10 +1769,11 @@
         <w:t>Nach der WiFi-Verbindung ist ein Diagnose-Server erreichbar. Die IP-Adresse wird auf der Info-Seite (S3) angezeigt sowie einmalig auf Serial ausgegeben.</w:t>
       </w:r>
     </w:p>
+    <w:p/>
     <w:tbl>
       <w:tblPr>
-        <w:tblW w:type="auto" w:w="0"/>
-        <w:tblLook w:firstColumn="1" w:firstRow="1" w:lastColumn="0" w:lastRow="0" w:noHBand="0" w:noVBand="1" w:val="04A0"/>
+        <w:tblW w:w="0" w:type="auto"/>
+        <w:tblLook w:val="04A0" w:firstRow="1" w:lastRow="0" w:firstColumn="1" w:lastColumn="0" w:noHBand="0" w:noVBand="1"/>
       </w:tblPr>
       <w:tblGrid>
         <w:gridCol w:w="4819"/>
@@ -1871,7 +1782,7 @@
       <w:tr>
         <w:tc>
           <w:tcPr>
-            <w:tcW w:type="dxa" w:w="4819"/>
+            <w:tcW w:w="4819" w:type="dxa"/>
           </w:tcPr>
           <w:p>
             <w:r>
@@ -1884,7 +1795,7 @@
         </w:tc>
         <w:tc>
           <w:tcPr>
-            <w:tcW w:type="dxa" w:w="4819"/>
+            <w:tcW w:w="4819" w:type="dxa"/>
           </w:tcPr>
           <w:p>
             <w:r>
@@ -1899,7 +1810,7 @@
       <w:tr>
         <w:tc>
           <w:tcPr>
-            <w:tcW w:type="dxa" w:w="4819"/>
+            <w:tcW w:w="4819" w:type="dxa"/>
           </w:tcPr>
           <w:p>
             <w:r>
@@ -1912,13 +1823,10 @@
         </w:tc>
         <w:tc>
           <w:tcPr>
-            <w:tcW w:type="dxa" w:w="4819"/>
-          </w:tcPr>
-          <w:p>
-            <w:r>
-              <w:rPr>
-                <w:b w:val="0"/>
-              </w:rPr>
+            <w:tcW w:w="4819" w:type="dxa"/>
+          </w:tcPr>
+          <w:p>
+            <w:r>
               <w:t>HTML-Seite mit farbiger Darstellung: grün = OK, rot = Fehler/Freeze, gelb = Warnung. Auto-Refresh alle 20 Sekunden.</w:t>
             </w:r>
           </w:p>
@@ -1927,7 +1835,7 @@
       <w:tr>
         <w:tc>
           <w:tcPr>
-            <w:tcW w:type="dxa" w:w="4819"/>
+            <w:tcW w:w="4819" w:type="dxa"/>
           </w:tcPr>
           <w:p>
             <w:r>
@@ -1940,13 +1848,10 @@
         </w:tc>
         <w:tc>
           <w:tcPr>
-            <w:tcW w:type="dxa" w:w="4819"/>
-          </w:tcPr>
-          <w:p>
-            <w:r>
-              <w:rPr>
-                <w:b w:val="0"/>
-              </w:rPr>
+            <w:tcW w:w="4819" w:type="dxa"/>
+          </w:tcPr>
+          <w:p>
+            <w:r>
               <w:t>Plain-Text-Ausgabe aller Log-Einträge – für curl, wget oder Browser-Download</w:t>
             </w:r>
           </w:p>
@@ -1955,7 +1860,7 @@
       <w:tr>
         <w:tc>
           <w:tcPr>
-            <w:tcW w:type="dxa" w:w="4819"/>
+            <w:tcW w:w="4819" w:type="dxa"/>
           </w:tcPr>
           <w:p>
             <w:r>
@@ -1968,13 +1873,10 @@
         </w:tc>
         <w:tc>
           <w:tcPr>
-            <w:tcW w:type="dxa" w:w="4819"/>
-          </w:tcPr>
-          <w:p>
-            <w:r>
-              <w:rPr>
-                <w:b w:val="0"/>
-              </w:rPr>
+            <w:tcW w:w="4819" w:type="dxa"/>
+          </w:tcPr>
+          <w:p>
+            <w:r>
               <w:t>Setzt die Mühlrad-Pulsweite (siehe Regler unten) direkt über einen Parameter, z.B. für eigene Skripte</w:t>
             </w:r>
           </w:p>
@@ -1989,8 +1891,8 @@
     </w:p>
     <w:tbl>
       <w:tblPr>
-        <w:tblW w:type="auto" w:w="0"/>
-        <w:tblLook w:firstColumn="1" w:firstRow="1" w:lastColumn="0" w:lastRow="0" w:noHBand="0" w:noVBand="1" w:val="04A0"/>
+        <w:tblW w:w="0" w:type="auto"/>
+        <w:tblLook w:val="04A0" w:firstRow="1" w:lastRow="0" w:firstColumn="1" w:lastColumn="0" w:noHBand="0" w:noVBand="1"/>
       </w:tblPr>
       <w:tblGrid>
         <w:gridCol w:w="4819"/>
@@ -1999,7 +1901,7 @@
       <w:tr>
         <w:tc>
           <w:tcPr>
-            <w:tcW w:type="dxa" w:w="4819"/>
+            <w:tcW w:w="4819" w:type="dxa"/>
           </w:tcPr>
           <w:p>
             <w:r>
@@ -2012,7 +1914,7 @@
         </w:tc>
         <w:tc>
           <w:tcPr>
-            <w:tcW w:type="dxa" w:w="4819"/>
+            <w:tcW w:w="4819" w:type="dxa"/>
           </w:tcPr>
           <w:p>
             <w:r>
@@ -2027,7 +1929,7 @@
       <w:tr>
         <w:tc>
           <w:tcPr>
-            <w:tcW w:type="dxa" w:w="4819"/>
+            <w:tcW w:w="4819" w:type="dxa"/>
           </w:tcPr>
           <w:p>
             <w:r>
@@ -2040,13 +1942,10 @@
         </w:tc>
         <w:tc>
           <w:tcPr>
-            <w:tcW w:type="dxa" w:w="4819"/>
-          </w:tcPr>
-          <w:p>
-            <w:r>
-              <w:rPr>
-                <w:b w:val="0"/>
-              </w:rPr>
+            <w:tcW w:w="4819" w:type="dxa"/>
+          </w:tcPr>
+          <w:p>
+            <w:r>
               <w:t>Schieberegler 0–100 %, stellt die Motor-Drehzahl live um und speichert den Wert dauerhaft. Unterhalb von 35 % gibt der Motor beim Start automatisch einen kurzen Vollgas-Anlaufimpuls (Kickstart), da der Motor sonst nicht anläuft (12v03)</w:t>
             </w:r>
           </w:p>
@@ -2055,7 +1954,7 @@
       <w:tr>
         <w:tc>
           <w:tcPr>
-            <w:tcW w:type="dxa" w:w="4819"/>
+            <w:tcW w:w="4819" w:type="dxa"/>
           </w:tcPr>
           <w:p>
             <w:r>
@@ -2068,13 +1967,10 @@
         </w:tc>
         <w:tc>
           <w:tcPr>
-            <w:tcW w:type="dxa" w:w="4819"/>
-          </w:tcPr>
-          <w:p>
-            <w:r>
-              <w:rPr>
-                <w:b w:val="0"/>
-              </w:rPr>
+            <w:tcW w:w="4819" w:type="dxa"/>
+          </w:tcPr>
+          <w:p>
+            <w:r>
               <w:t>Eigener Ring-Puffer-Ausschnitt mit allen DFPlayer-Meldungen (Start-Check, Absturz-Neustart, Serial2-Restbytes). Titel lautet „DFPlayer – letzter erfolgreicher Alarm: &lt;Zeitstempel&gt;" (12v08)</w:t>
             </w:r>
           </w:p>
@@ -2083,7 +1979,7 @@
       <w:tr>
         <w:tc>
           <w:tcPr>
-            <w:tcW w:type="dxa" w:w="4819"/>
+            <w:tcW w:w="4819" w:type="dxa"/>
           </w:tcPr>
           <w:p>
             <w:r>
@@ -2096,13 +1992,10 @@
         </w:tc>
         <w:tc>
           <w:tcPr>
-            <w:tcW w:type="dxa" w:w="4819"/>
-          </w:tcPr>
-          <w:p>
-            <w:r>
-              <w:rPr>
-                <w:b w:val="0"/>
-              </w:rPr>
+            <w:tcW w:w="4819" w:type="dxa"/>
+          </w:tcPr>
+          <w:p>
+            <w:r>
               <w:t>Ring-Puffer mit den übrigen Systemereignissen (Start, WiFi/NTP-Events, Watchdog, Alarme). Titel lautet „Allgemeines Log – letzter Reset: &lt;NTP-Zeitstempel&gt;" (Zeitpunkt des ersten NTP-Syncs nach dem Reset)</w:t>
             </w:r>
           </w:p>
@@ -2111,7 +2004,7 @@
       <w:tr>
         <w:tc>
           <w:tcPr>
-            <w:tcW w:type="dxa" w:w="4819"/>
+            <w:tcW w:w="4819" w:type="dxa"/>
           </w:tcPr>
           <w:p>
             <w:r>
@@ -2124,13 +2017,10 @@
         </w:tc>
         <w:tc>
           <w:tcPr>
-            <w:tcW w:type="dxa" w:w="4819"/>
-          </w:tcPr>
-          <w:p>
-            <w:r>
-              <w:rPr>
-                <w:b w:val="0"/>
-              </w:rPr>
+            <w:tcW w:w="4819" w:type="dxa"/>
+          </w:tcPr>
+          <w:p>
+            <w:r>
               <w:t>Zeigt die Zeitstempel der letzten WiFi-Verbindung und der letzten NTP-Synchronisation (11v02: umbenannt von „Status – Letzter Start" und unter den Ring-Puffer verschoben)</w:t>
             </w:r>
           </w:p>
@@ -2139,7 +2029,7 @@
       <w:tr>
         <w:tc>
           <w:tcPr>
-            <w:tcW w:type="dxa" w:w="4819"/>
+            <w:tcW w:w="4819" w:type="dxa"/>
           </w:tcPr>
           <w:p>
             <w:r>
@@ -2152,13 +2042,10 @@
         </w:tc>
         <w:tc>
           <w:tcPr>
-            <w:tcW w:type="dxa" w:w="4819"/>
-          </w:tcPr>
-          <w:p>
-            <w:r>
-              <w:rPr>
-                <w:b w:val="0"/>
-              </w:rPr>
+            <w:tcW w:w="4819" w:type="dxa"/>
+          </w:tcPr>
+          <w:p>
+            <w:r>
               <w:t>Letzter Messwert und Schwellwert aller vier Touch-Pads</w:t>
             </w:r>
           </w:p>
@@ -2167,7 +2054,7 @@
       <w:tr>
         <w:tc>
           <w:tcPr>
-            <w:tcW w:type="dxa" w:w="4819"/>
+            <w:tcW w:w="4819" w:type="dxa"/>
           </w:tcPr>
           <w:p>
             <w:r>
@@ -2180,13 +2067,10 @@
         </w:tc>
         <w:tc>
           <w:tcPr>
-            <w:tcW w:type="dxa" w:w="4819"/>
-          </w:tcPr>
-          <w:p>
-            <w:r>
-              <w:rPr>
-                <w:b w:val="0"/>
-              </w:rPr>
+            <w:tcW w:w="4819" w:type="dxa"/>
+          </w:tcPr>
+          <w:p>
+            <w:r>
               <w:t>Speicherauslastung aller 9 Tasks + freier Heap</w:t>
             </w:r>
           </w:p>
@@ -2211,18 +2095,57 @@
         <w:rPr>
           <w:b/>
         </w:rPr>
-        <w:t xml:space="preserve">Hinweis „Lautstaerke+/- fehlgeschlagen (Mutex belegt)":  </w:t>
+        <w:t>Hinweis „Lautst</w:t>
+      </w:r>
+      <w:r>
+        <w:rPr>
+          <w:b/>
+        </w:rPr>
+        <w:t>ä</w:t>
+      </w:r>
+      <w:r>
+        <w:rPr>
+          <w:b/>
+        </w:rPr>
+        <w:t>rke</w:t>
+      </w:r>
+      <w:r>
+        <w:rPr>
+          <w:b/>
+        </w:rPr>
+        <w:t xml:space="preserve"> </w:t>
+      </w:r>
+      <w:r>
+        <w:rPr>
+          <w:b/>
+        </w:rPr>
+        <w:t xml:space="preserve">+/- fehlgeschlagen (Mutex belegt)":  </w:t>
       </w:r>
       <w:r>
         <w:t xml:space="preserve">  Während ein Alarm läuft, fragt der Wecker den DFPlayer-Status alle 5 Sekunden kurz ab und belegt dafür kurzzeitig den internen Player-Zugriff. Trifft ein Tastendruck auf T3/T4 (Lautstärke +/–) genau in dieses Fenster, wird dieser eine Druck verworfen und im Log als Fehler vermerkt – Anzeige und Lautstärke bleiben für diesen Druck bewusst unverändert, damit nie ein falscher Wert angezeigt oder gespeichert wird. Bei mehrfachem/gehaltenem Tippen (Touch-Repeat) wirken die übrigen Drücke im selben Moment normal, sodass die Lautstärke trotz einzelner Fehlermeldung sichtbar ansteigt. Kein Fehlverhalten – kein Handlungsbedarf.</w:t>
       </w:r>
     </w:p>
     <w:p/>
+    <w:p>
+      <w:pPr>
+        <w:rPr>
+          <w:b/>
+          <w:bCs/>
+          <w:color w:val="1F4E79"/>
+          <w:sz w:val="26"/>
+          <w:szCs w:val="26"/>
+        </w:rPr>
+      </w:pPr>
+      <w:r>
+        <w:br w:type="page"/>
+      </w:r>
+    </w:p>
     <w:p>
       <w:pPr>
         <w:pStyle w:val="berschrift1"/>
       </w:pPr>
       <w:r>
+        <w:lastRenderedPageBreak/>
         <w:t>9.  WiFi-Konfiguration</w:t>
       </w:r>
     </w:p>
@@ -2260,8 +2183,8 @@
     <w:p/>
     <w:tbl>
       <w:tblPr>
-        <w:tblW w:type="auto" w:w="0"/>
-        <w:tblLook w:firstColumn="1" w:firstRow="1" w:lastColumn="0" w:lastRow="0" w:noHBand="0" w:noVBand="1" w:val="04A0"/>
+        <w:tblW w:w="0" w:type="auto"/>
+        <w:tblLook w:val="04A0" w:firstRow="1" w:lastRow="0" w:firstColumn="1" w:lastColumn="0" w:noHBand="0" w:noVBand="1"/>
       </w:tblPr>
       <w:tblGrid>
         <w:gridCol w:w="4819"/>
@@ -2270,7 +2193,7 @@
       <w:tr>
         <w:tc>
           <w:tcPr>
-            <w:tcW w:type="dxa" w:w="4819"/>
+            <w:tcW w:w="4819" w:type="dxa"/>
           </w:tcPr>
           <w:p>
             <w:r>
@@ -2283,7 +2206,7 @@
         </w:tc>
         <w:tc>
           <w:tcPr>
-            <w:tcW w:type="dxa" w:w="4819"/>
+            <w:tcW w:w="4819" w:type="dxa"/>
           </w:tcPr>
           <w:p>
             <w:r>
@@ -2298,7 +2221,7 @@
       <w:tr>
         <w:tc>
           <w:tcPr>
-            <w:tcW w:type="dxa" w:w="4819"/>
+            <w:tcW w:w="4819" w:type="dxa"/>
           </w:tcPr>
           <w:p>
             <w:r>
@@ -2311,13 +2234,10 @@
         </w:tc>
         <w:tc>
           <w:tcPr>
-            <w:tcW w:type="dxa" w:w="4819"/>
-          </w:tcPr>
-          <w:p>
-            <w:r>
-              <w:rPr>
-                <w:b w:val="0"/>
-              </w:rPr>
+            <w:tcW w:w="4819" w:type="dxa"/>
+          </w:tcPr>
+          <w:p>
+            <w:r>
               <w:t>1–32 Zeichen, Groß-/Kleinschreibung beachten</w:t>
             </w:r>
           </w:p>
@@ -2326,7 +2246,7 @@
       <w:tr>
         <w:tc>
           <w:tcPr>
-            <w:tcW w:type="dxa" w:w="4819"/>
+            <w:tcW w:w="4819" w:type="dxa"/>
           </w:tcPr>
           <w:p>
             <w:r>
@@ -2339,13 +2259,10 @@
         </w:tc>
         <w:tc>
           <w:tcPr>
-            <w:tcW w:type="dxa" w:w="4819"/>
-          </w:tcPr>
-          <w:p>
-            <w:r>
-              <w:rPr>
-                <w:b w:val="0"/>
-              </w:rPr>
+            <w:tcW w:w="4819" w:type="dxa"/>
+          </w:tcPr>
+          <w:p>
+            <w:r>
               <w:t>Leer lassen für offene Netzwerke. Sonst 8–63 Zeichen.</w:t>
             </w:r>
           </w:p>
@@ -2354,7 +2271,7 @@
       <w:tr>
         <w:tc>
           <w:tcPr>
-            <w:tcW w:type="dxa" w:w="4819"/>
+            <w:tcW w:w="4819" w:type="dxa"/>
           </w:tcPr>
           <w:p>
             <w:r>
@@ -2367,13 +2284,10 @@
         </w:tc>
         <w:tc>
           <w:tcPr>
-            <w:tcW w:type="dxa" w:w="4819"/>
-          </w:tcPr>
-          <w:p>
-            <w:r>
-              <w:rPr>
-                <w:b w:val="0"/>
-              </w:rPr>
+            <w:tcW w:w="4819" w:type="dxa"/>
+          </w:tcPr>
+          <w:p>
+            <w:r>
               <w:t>Bei falschen Zugangsdaten erscheint eine Fehlermeldung auf der Konfigurationsseite</w:t>
             </w:r>
           </w:p>
@@ -2413,18 +2327,10 @@
       </w:pPr>
       <w:r>
         <w:rPr>
-          <w:b w:val="0"/>
           <w:i/>
           <w:sz w:val="16"/>
         </w:rPr>
-        <w:t>bTn</w:t>
-      </w:r>
-      <w:r>
-        <w:rPr>
-          <w:i/>
-          <w:sz w:val="16"/>
-        </w:rPr>
-        <w:t xml:space="preserve"> Wecker  ·  Bedienungsanleitung  ·  Firmware 20v21</w:t>
+        <w:t>bTn Wecker  ·  Bedienungsanleitung  ·  Firmware 20v21</w:t>
       </w:r>
     </w:p>
     <w:sectPr>

</xml_diff>